<commit_message>
Docs: rewrite for new rules — H5 lottery (replaces like-ranking) + new sponsor model (2 clients/week, 4 products each, priority + exclusivity)
</commit_message>
<xml_diff>
--- a/ETF世界杯H5产研交接文档.docx
+++ b/ETF世界杯H5产研交接文档.docx
@@ -1437,7 +1437,7 @@
           <w:sz w:val="21"/>
           <w:szCs w:val="21"/>
         </w:rPr>
-        <w:t xml:space="preserve">阵容结果页：5 维评分 + 系统点评 + 一键发布</w:t>
+        <w:t xml:space="preserve">阵容结果页：5 维评分 + 系统点评</w:t>
       </w:r>
     </w:p>
     <w:p>
@@ -1455,7 +1455,7 @@
           <w:sz w:val="21"/>
           <w:szCs w:val="21"/>
         </w:rPr>
-        <w:t xml:space="preserve">一键发布：加自选 → 生成海报 → 保存到相册</w:t>
+        <w:t xml:space="preserve">一键发布：加自选（付费客户产品）→ 生成海报</w:t>
       </w:r>
     </w:p>
     <w:p>
@@ -1473,7 +1473,25 @@
           <w:sz w:val="21"/>
           <w:szCs w:val="21"/>
         </w:rPr>
-        <w:t xml:space="preserve">用户把海报跟帖到雪球活动主贴 / 分享朋友圈</w:t>
+        <w:t xml:space="preserve">海报生成后立即抽奖，即时弹出是否中奖</w:t>
+      </w:r>
+    </w:p>
+    <w:p>
+      <w:pPr>
+        <w:pStyle w:val="ListParagraph"/>
+        <w:numPr>
+          <w:ilvl w:val="0"/>
+          <w:numId w:val="3"/>
+        </w:numPr>
+        <w:spacing w:after="60"/>
+      </w:pPr>
+      <w:r>
+        <w:rPr>
+          <w:rFonts w:ascii="微软雅黑" w:cs="微软雅黑" w:eastAsia="微软雅黑" w:hAnsi="微软雅黑"/>
+          <w:sz w:val="21"/>
+          <w:szCs w:val="21"/>
+        </w:rPr>
+        <w:t xml:space="preserve">中奖后可选择到雪球活动主帖发帖晒奖</w:t>
       </w:r>
     </w:p>
     <w:p>
@@ -2544,7 +2562,7 @@
           <w:sz w:val="21"/>
           <w:szCs w:val="21"/>
         </w:rPr>
-        <w:t xml:space="preserve">5 步玩法卡（点击进规则页）：①3 题测试找"老板风格" ②选阵型+配 11 只 ETF ③生成海报跟帖主贴 ④每周点赞 TOP 1 得白酒一瓶 ⑤每周点赞 2-5 名得棒球帽</w:t>
+        <w:t xml:space="preserve">玩法卡（点击进规则页）：①3 题测试找"老板风格" ②选阵型+配 11 只 ETF ③一键发布加自选+生成海报 ④海报生成后立即抽奖 ⑤一周一次机会，抽帽子 / 白酒</w:t>
       </w:r>
     </w:p>
     <w:p>
@@ -5003,7 +5021,42 @@
           <w:sz w:val="21"/>
           <w:szCs w:val="21"/>
         </w:rPr>
-        <w:t xml:space="preserve">操作区 3 个按钮（见 5.6 / 第六章）：① 一键发布 ② 分享朋友圈 ③ 重新组队</w:t>
+        <w:t xml:space="preserve">一键发布：加自选 → 生成海报 → 立即抽奖（见第六章）</w:t>
+      </w:r>
+    </w:p>
+    <w:p>
+      <w:pPr>
+        <w:pStyle w:val="ListParagraph"/>
+        <w:numPr>
+          <w:ilvl w:val="0"/>
+          <w:numId w:val="2"/>
+        </w:numPr>
+        <w:spacing w:after="60"/>
+      </w:pPr>
+      <w:r>
+        <w:rPr>
+          <w:rFonts w:ascii="微软雅黑" w:cs="微软雅黑" w:eastAsia="微软雅黑" w:hAnsi="微软雅黑"/>
+          <w:sz w:val="21"/>
+          <w:szCs w:val="21"/>
+        </w:rPr>
+        <w:t xml:space="preserve">抽奖结果即时弹出；中奖后可选择到雪球活动主帖发帖晒奖</w:t>
+      </w:r>
+    </w:p>
+    <w:p>
+      <w:pPr>
+        <w:shd w:fill="FFF6E0" w:val="clear"/>
+        <w:spacing w:after="100"/>
+      </w:pPr>
+      <w:r>
+        <w:rPr>
+          <w:rFonts w:ascii="微软雅黑" w:cs="微软雅黑" w:eastAsia="微软雅黑" w:hAnsi="微软雅黑"/>
+          <w:i/>
+          <w:iCs/>
+          <w:color w:val="666666"/>
+          <w:sz w:val="19"/>
+          <w:szCs w:val="19"/>
+        </w:rPr>
+        <w:t xml:space="preserve">当前线上原型 Result 页仍为旧版「点赞冲榜」交互（一键发布 / 分享朋友圈 / 重新组队）。抽奖玩法以本文档第六章为准，待产研重构。</w:t>
       </w:r>
     </w:p>
     <w:p>
@@ -6586,20 +6639,24 @@
           <w:sz w:val="24"/>
           <w:szCs w:val="24"/>
         </w:rPr>
-        <w:t xml:space="preserve">5.3 招商客户「跑马灯」轮转</w:t>
-      </w:r>
-    </w:p>
-    <w:p>
-      <w:pPr>
-        <w:spacing w:after="100"/>
-      </w:pPr>
-      <w:r>
-        <w:rPr>
-          <w:rFonts w:ascii="微软雅黑" w:cs="微软雅黑" w:eastAsia="微软雅黑" w:hAnsi="微软雅黑"/>
-          <w:sz w:val="21"/>
-          <w:szCs w:val="21"/>
-        </w:rPr>
-        <w:t xml:space="preserve">已付费招商客户占据每个位置 ETF 列表的头部「头牌位」。每个客户在所属位置贡献其头牌产品（sortWeight 最高的一只），按轮转顺序排列；排第一位的产品带「今日推荐」金色徽章。</w:t>
+        <w:t xml:space="preserve">5.3 招商售卖模型</w:t>
+      </w:r>
+    </w:p>
+    <w:p>
+      <w:pPr>
+        <w:pStyle w:val="Heading3"/>
+        <w:spacing w:after="110" w:before="200"/>
+      </w:pPr>
+      <w:r>
+        <w:rPr>
+          <w:rFonts w:ascii="微软雅黑" w:cs="微软雅黑" w:eastAsia="微软雅黑" w:hAnsi="微软雅黑"/>
+          <w:b/>
+          <w:bCs/>
+          <w:color w:val="2A85E0"/>
+          <w:sz w:val="21"/>
+          <w:szCs w:val="21"/>
+        </w:rPr>
+        <w:t xml:space="preserve">售卖规则</w:t>
       </w:r>
     </w:p>
     <w:p>
@@ -6617,7 +6674,7 @@
           <w:sz w:val="21"/>
           <w:szCs w:val="21"/>
         </w:rPr>
-        <w:t xml:space="preserve">活动第 1 天：头牌位按招商客户签约顺序排列</w:t>
+        <w:t xml:space="preserve">每周最多售卖给 2 个付费客户</w:t>
       </w:r>
     </w:p>
     <w:p>
@@ -6635,7 +6692,7 @@
           <w:sz w:val="21"/>
           <w:szCs w:val="21"/>
         </w:rPr>
-        <w:t xml:space="preserve">从第 2 天起：整体跑马灯式轮转一位，原第一位移到末位</w:t>
+        <w:t xml:space="preserve">每个客户提供 4 只 ETF：前锋 / 中场 / 后卫 / 门将 各 1 只</w:t>
       </w:r>
     </w:p>
     <w:p>
@@ -6653,7 +6710,167 @@
           <w:sz w:val="21"/>
           <w:szCs w:val="21"/>
         </w:rPr>
-        <w:t xml:space="preserve">示例（华夏→易方达→富国）：第 1 天华夏/易方达/富国，第 2 天易方达/富国/华夏，第 3 天富国/华夏/易方达，循环</w:t>
+        <w:t xml:space="preserve">价格：10 万元 / 客户 / 周</w:t>
+      </w:r>
+    </w:p>
+    <w:p>
+      <w:pPr>
+        <w:pStyle w:val="ListParagraph"/>
+        <w:numPr>
+          <w:ilvl w:val="0"/>
+          <w:numId w:val="2"/>
+        </w:numPr>
+        <w:spacing w:after="60"/>
+      </w:pPr>
+      <w:r>
+        <w:rPr>
+          <w:rFonts w:ascii="微软雅黑" w:cs="微软雅黑" w:eastAsia="微软雅黑" w:hAnsi="微软雅黑"/>
+          <w:sz w:val="21"/>
+          <w:szCs w:val="21"/>
+        </w:rPr>
+        <w:t xml:space="preserve">8 只产品（2 客户 × 4 只）进入对应位置的 ETF 池，获得展示曝光</w:t>
+      </w:r>
+    </w:p>
+    <w:p>
+      <w:pPr>
+        <w:pStyle w:val="Heading3"/>
+        <w:spacing w:after="110" w:before="200"/>
+      </w:pPr>
+      <w:r>
+        <w:rPr>
+          <w:rFonts w:ascii="微软雅黑" w:cs="微软雅黑" w:eastAsia="微软雅黑" w:hAnsi="微软雅黑"/>
+          <w:b/>
+          <w:bCs/>
+          <w:color w:val="2A85E0"/>
+          <w:sz w:val="21"/>
+          <w:szCs w:val="21"/>
+        </w:rPr>
+        <w:t xml:space="preserve">加自选优先级</w:t>
+      </w:r>
+    </w:p>
+    <w:p>
+      <w:pPr>
+        <w:pStyle w:val="ListParagraph"/>
+        <w:numPr>
+          <w:ilvl w:val="0"/>
+          <w:numId w:val="2"/>
+        </w:numPr>
+        <w:spacing w:after="60"/>
+      </w:pPr>
+      <w:r>
+        <w:rPr>
+          <w:rFonts w:ascii="微软雅黑" w:cs="微软雅黑" w:eastAsia="微软雅黑" w:hAnsi="微软雅黑"/>
+          <w:sz w:val="21"/>
+          <w:szCs w:val="21"/>
+        </w:rPr>
+        <w:t xml:space="preserve">每个客户对自己的 4 只产品排优先级，指定最希望被加自选的 1 个位置</w:t>
+      </w:r>
+    </w:p>
+    <w:p>
+      <w:pPr>
+        <w:pStyle w:val="ListParagraph"/>
+        <w:numPr>
+          <w:ilvl w:val="0"/>
+          <w:numId w:val="2"/>
+        </w:numPr>
+        <w:spacing w:after="60"/>
+      </w:pPr>
+      <w:r>
+        <w:rPr>
+          <w:rFonts w:ascii="微软雅黑" w:cs="微软雅黑" w:eastAsia="微软雅黑" w:hAnsi="微软雅黑"/>
+          <w:sz w:val="21"/>
+          <w:szCs w:val="21"/>
+        </w:rPr>
+        <w:t xml:space="preserve">用户在 H5 完成「加自选」时，每个客户只有 1 只产品被加入自选 —— 即该客户优先级最高位置的那只</w:t>
+      </w:r>
+    </w:p>
+    <w:p>
+      <w:pPr>
+        <w:pStyle w:val="ListParagraph"/>
+        <w:numPr>
+          <w:ilvl w:val="0"/>
+          <w:numId w:val="2"/>
+        </w:numPr>
+        <w:spacing w:after="60"/>
+      </w:pPr>
+      <w:r>
+        <w:rPr>
+          <w:rFonts w:ascii="微软雅黑" w:cs="微软雅黑" w:eastAsia="微软雅黑" w:hAnsi="微软雅黑"/>
+          <w:sz w:val="21"/>
+          <w:szCs w:val="21"/>
+        </w:rPr>
+        <w:t xml:space="preserve">2 个客户 = 用户共加 2 只自选（来自 2 个不同位置）</w:t>
+      </w:r>
+    </w:p>
+    <w:p>
+      <w:pPr>
+        <w:pStyle w:val="Heading3"/>
+        <w:spacing w:after="110" w:before="200"/>
+      </w:pPr>
+      <w:r>
+        <w:rPr>
+          <w:rFonts w:ascii="微软雅黑" w:cs="微软雅黑" w:eastAsia="微软雅黑" w:hAnsi="微软雅黑"/>
+          <w:b/>
+          <w:bCs/>
+          <w:color w:val="2A85E0"/>
+          <w:sz w:val="21"/>
+          <w:szCs w:val="21"/>
+        </w:rPr>
+        <w:t xml:space="preserve">排他性与下单顺序</w:t>
+      </w:r>
+    </w:p>
+    <w:p>
+      <w:pPr>
+        <w:pStyle w:val="ListParagraph"/>
+        <w:numPr>
+          <w:ilvl w:val="0"/>
+          <w:numId w:val="2"/>
+        </w:numPr>
+        <w:spacing w:after="60"/>
+      </w:pPr>
+      <w:r>
+        <w:rPr>
+          <w:rFonts w:ascii="微软雅黑" w:cs="微软雅黑" w:eastAsia="微软雅黑" w:hAnsi="微软雅黑"/>
+          <w:sz w:val="21"/>
+          <w:szCs w:val="21"/>
+        </w:rPr>
+        <w:t xml:space="preserve">一个客户选定某个位置类型作为加自选优先位后，第二个客户不能再选同一位置类型</w:t>
+      </w:r>
+    </w:p>
+    <w:p>
+      <w:pPr>
+        <w:pStyle w:val="ListParagraph"/>
+        <w:numPr>
+          <w:ilvl w:val="0"/>
+          <w:numId w:val="2"/>
+        </w:numPr>
+        <w:spacing w:after="60"/>
+      </w:pPr>
+      <w:r>
+        <w:rPr>
+          <w:rFonts w:ascii="微软雅黑" w:cs="微软雅黑" w:eastAsia="微软雅黑" w:hAnsi="微软雅黑"/>
+          <w:sz w:val="21"/>
+          <w:szCs w:val="21"/>
+        </w:rPr>
+        <w:t xml:space="preserve">先下单的客户优先选位置，后下单的客户只能从剩余位置中选 —— 最终结果与下单顺序强相关</w:t>
+      </w:r>
+    </w:p>
+    <w:p>
+      <w:pPr>
+        <w:pStyle w:val="ListParagraph"/>
+        <w:numPr>
+          <w:ilvl w:val="0"/>
+          <w:numId w:val="2"/>
+        </w:numPr>
+        <w:spacing w:after="60"/>
+      </w:pPr>
+      <w:r>
+        <w:rPr>
+          <w:rFonts w:ascii="微软雅黑" w:cs="微软雅黑" w:eastAsia="微软雅黑" w:hAnsi="微软雅黑"/>
+          <w:sz w:val="21"/>
+          <w:szCs w:val="21"/>
+        </w:rPr>
+        <w:t xml:space="preserve">示例：客户 A 先下单选「前锋」→ 客户 B 下单时只能从中场 / 后卫 / 门将中选</w:t>
       </w:r>
     </w:p>
     <w:p>
@@ -6670,7 +6887,7 @@
           <w:sz w:val="19"/>
           <w:szCs w:val="19"/>
         </w:rPr>
-        <w:t xml:space="preserve">当前付费名单写死在 src/utils/sponsorRotation.js 的 PAID_SPONSORS；上线需接后端接口 GET /api/etf-campaign/sponsors。活动起始日 ACTIVITY_START 也在该文件。</w:t>
+        <w:t xml:space="preserve">H5 侧只负责按后端返回的"本周付费客户 + 各自加自选产品"执行加自选；排他性、下单顺序判定由运营后台 / 招商侧处理。接口见第七章。</w:t>
       </w:r>
     </w:p>
     <w:p>
@@ -6723,7 +6940,7 @@
           <w:sz w:val="21"/>
           <w:szCs w:val="21"/>
         </w:rPr>
-        <w:t xml:space="preserve">海报内容：雪球 logo / 队名 / 阵型 / 球场 11 圆点 / 11 只 ETF 分组列表 / 5 维评分 / 系统点评 / 奖品提示 / 二维码</w:t>
+        <w:t xml:space="preserve">海报内容：雪球 logo / 队名 / 阵型 / 球场 11 圆点 / 11 只 ETF 分组列表 / 5 维评分 / 系统点评 / 二维码</w:t>
       </w:r>
     </w:p>
     <w:p>
@@ -6742,6 +6959,24 @@
           <w:szCs w:val="21"/>
         </w:rPr>
         <w:t xml:space="preserve">二维码内容为 H5 首页 URL，扫码可进入活动；上线可改为带渠道追踪参数的 URL</w:t>
+      </w:r>
+    </w:p>
+    <w:p>
+      <w:pPr>
+        <w:pStyle w:val="ListParagraph"/>
+        <w:numPr>
+          <w:ilvl w:val="0"/>
+          <w:numId w:val="2"/>
+        </w:numPr>
+        <w:spacing w:after="60"/>
+      </w:pPr>
+      <w:r>
+        <w:rPr>
+          <w:rFonts w:ascii="微软雅黑" w:cs="微软雅黑" w:eastAsia="微软雅黑" w:hAnsi="微软雅黑"/>
+          <w:sz w:val="21"/>
+          <w:szCs w:val="21"/>
+        </w:rPr>
+        <w:t xml:space="preserve">海报生成完成即触发抽奖（见第六章），结果即时弹出</w:t>
       </w:r>
     </w:p>
     <w:p>
@@ -6759,7 +6994,24 @@
           <w:sz w:val="30"/>
           <w:szCs w:val="30"/>
         </w:rPr>
-        <w:t xml:space="preserve">六、抽奖与评奖规则</w:t>
+        <w:t xml:space="preserve">六、抽奖玩法与规则</w:t>
+      </w:r>
+    </w:p>
+    <w:p>
+      <w:pPr>
+        <w:shd w:fill="FFF6E0" w:val="clear"/>
+        <w:spacing w:after="100"/>
+      </w:pPr>
+      <w:r>
+        <w:rPr>
+          <w:rFonts w:ascii="微软雅黑" w:cs="微软雅黑" w:eastAsia="微软雅黑" w:hAnsi="微软雅黑"/>
+          <w:i/>
+          <w:iCs/>
+          <w:color w:val="666666"/>
+          <w:sz w:val="19"/>
+          <w:szCs w:val="19"/>
+        </w:rPr>
+        <w:t xml:space="preserve">重要变更：原"跟帖主贴集赞冲榜"玩法因实现限制已取消，改为 H5 页面内抽奖。本章为最新玩法，产研以此为准。</w:t>
       </w:r>
     </w:p>
     <w:p>
@@ -6776,7 +7028,7 @@
           <w:sz w:val="24"/>
           <w:szCs w:val="24"/>
         </w:rPr>
-        <w:t xml:space="preserve">6.1 玩法说明（规则页文案）</w:t>
+        <w:t xml:space="preserve">6.1 玩法说明</w:t>
       </w:r>
     </w:p>
     <w:p>
@@ -6830,7 +7082,7 @@
           <w:sz w:val="21"/>
           <w:szCs w:val="21"/>
         </w:rPr>
-        <w:t xml:space="preserve">生成专属阵容海报，保存图片</w:t>
+        <w:t xml:space="preserve">点「一键发布」：加自选 → 生成海报</w:t>
       </w:r>
     </w:p>
     <w:p>
@@ -6848,7 +7100,7 @@
           <w:sz w:val="21"/>
           <w:szCs w:val="21"/>
         </w:rPr>
-        <w:t xml:space="preserve">打开雪球活动主贴，在评论区跟帖发布你的海报</w:t>
+        <w:t xml:space="preserve">海报生成后立即抽奖，即时知道是否中奖</w:t>
       </w:r>
     </w:p>
     <w:p>
@@ -6866,7 +7118,7 @@
           <w:sz w:val="21"/>
           <w:szCs w:val="21"/>
         </w:rPr>
-        <w:t xml:space="preserve">球友在主贴下方为你的海报点赞，集赞越多排名越靠前</w:t>
+        <w:t xml:space="preserve">中奖后可选择到雪球活动主帖发帖晒奖</w:t>
       </w:r>
     </w:p>
     <w:p>
@@ -6883,7 +7135,7 @@
           <w:sz w:val="24"/>
           <w:szCs w:val="24"/>
         </w:rPr>
-        <w:t xml:space="preserve">6.2 点赞规则</w:t>
+        <w:t xml:space="preserve">6.2 抽奖机制</w:t>
       </w:r>
     </w:p>
     <w:p>
@@ -6901,7 +7153,7 @@
           <w:sz w:val="21"/>
           <w:szCs w:val="21"/>
         </w:rPr>
-        <w:t xml:space="preserve">所有点赞均发生在雪球活动主贴评论区，认用户海报跟帖的点赞数</w:t>
+        <w:t xml:space="preserve">抽奖在 H5 页面内进行，不再依赖主贴点赞</w:t>
       </w:r>
     </w:p>
     <w:p>
@@ -6919,7 +7171,7 @@
           <w:sz w:val="21"/>
           <w:szCs w:val="21"/>
         </w:rPr>
-        <w:t xml:space="preserve">每个用户每天最多为同一条海报点赞 1 次</w:t>
+        <w:t xml:space="preserve">获得抽奖机会的条件：用户在 H5 完成「加自选 + 生成海报」</w:t>
       </w:r>
     </w:p>
     <w:p>
@@ -6937,7 +7189,61 @@
           <w:sz w:val="21"/>
           <w:szCs w:val="21"/>
         </w:rPr>
-        <w:t xml:space="preserve">检测到刷赞 / 小号互赞将取消评奖资格</w:t>
+        <w:t xml:space="preserve">频次：一周一人仅 1 次抽奖机会</w:t>
+      </w:r>
+    </w:p>
+    <w:p>
+      <w:pPr>
+        <w:pStyle w:val="ListParagraph"/>
+        <w:numPr>
+          <w:ilvl w:val="0"/>
+          <w:numId w:val="2"/>
+        </w:numPr>
+        <w:spacing w:after="60"/>
+      </w:pPr>
+      <w:r>
+        <w:rPr>
+          <w:rFonts w:ascii="微软雅黑" w:cs="微软雅黑" w:eastAsia="微软雅黑" w:hAnsi="微软雅黑"/>
+          <w:sz w:val="21"/>
+          <w:szCs w:val="21"/>
+        </w:rPr>
+        <w:t xml:space="preserve">即时性：海报生成完成后立即触发抽奖，结果即时弹出（中奖 / 谢谢参与），无抽奖动画</w:t>
+      </w:r>
+    </w:p>
+    <w:p>
+      <w:pPr>
+        <w:pStyle w:val="ListParagraph"/>
+        <w:numPr>
+          <w:ilvl w:val="0"/>
+          <w:numId w:val="2"/>
+        </w:numPr>
+        <w:spacing w:after="60"/>
+      </w:pPr>
+      <w:r>
+        <w:rPr>
+          <w:rFonts w:ascii="微软雅黑" w:cs="微软雅黑" w:eastAsia="微软雅黑" w:hAnsi="微软雅黑"/>
+          <w:sz w:val="21"/>
+          <w:szCs w:val="21"/>
+        </w:rPr>
+        <w:t xml:space="preserve">中奖后：用户可选择到雪球活动主帖发帖晒奖</w:t>
+      </w:r>
+    </w:p>
+    <w:p>
+      <w:pPr>
+        <w:pStyle w:val="ListParagraph"/>
+        <w:numPr>
+          <w:ilvl w:val="0"/>
+          <w:numId w:val="2"/>
+        </w:numPr>
+        <w:spacing w:after="60"/>
+      </w:pPr>
+      <w:r>
+        <w:rPr>
+          <w:rFonts w:ascii="微软雅黑" w:cs="微软雅黑" w:eastAsia="微软雅黑" w:hAnsi="微软雅黑"/>
+          <w:sz w:val="21"/>
+          <w:szCs w:val="21"/>
+        </w:rPr>
+        <w:t xml:space="preserve">抽奖各环节需完整埋点（获得机会、抽奖触发、中奖结果、去主帖发帖）</w:t>
       </w:r>
     </w:p>
     <w:p>
@@ -6954,7 +7260,7 @@
           <w:sz w:val="24"/>
           <w:szCs w:val="24"/>
         </w:rPr>
-        <w:t xml:space="preserve">6.3 评奖规则（按周评奖）</w:t>
+        <w:t xml:space="preserve">6.3 奖品设置</w:t>
       </w:r>
     </w:p>
     <w:tbl>
@@ -6970,9 +7276,9 @@
         </w:tblBorders>
       </w:tblPr>
       <w:tblGrid>
-        <w:gridCol w:w="2200"/>
-        <w:gridCol w:w="2400"/>
-        <w:gridCol w:w="4760"/>
+        <w:gridCol w:w="2600"/>
+        <w:gridCol w:w="3000"/>
+        <w:gridCol w:w="3760"/>
       </w:tblGrid>
       <w:tr>
         <w:trPr>
@@ -6980,7 +7286,7 @@
         </w:trPr>
         <w:tc>
           <w:tcPr>
-            <w:tcW w:type="dxa" w:w="2200"/>
+            <w:tcW w:type="dxa" w:w="2600"/>
             <w:tcBorders>
               <w:top w:val="single" w:color="CCCCCC" w:sz="6"/>
               <w:left w:val="single" w:color="CCCCCC" w:sz="6"/>
@@ -7007,13 +7313,13 @@
                 <w:sz w:val="19"/>
                 <w:szCs w:val="19"/>
               </w:rPr>
-              <w:t xml:space="preserve">奖项</w:t>
-            </w:r>
-          </w:p>
-        </w:tc>
-        <w:tc>
-          <w:tcPr>
-            <w:tcW w:type="dxa" w:w="2400"/>
+              <w:t xml:space="preserve">奖品</w:t>
+            </w:r>
+          </w:p>
+        </w:tc>
+        <w:tc>
+          <w:tcPr>
+            <w:tcW w:type="dxa" w:w="3000"/>
             <w:tcBorders>
               <w:top w:val="single" w:color="CCCCCC" w:sz="6"/>
               <w:left w:val="single" w:color="CCCCCC" w:sz="6"/>
@@ -7040,13 +7346,13 @@
                 <w:sz w:val="19"/>
                 <w:szCs w:val="19"/>
               </w:rPr>
-              <w:t xml:space="preserve">评选方式</w:t>
-            </w:r>
-          </w:p>
-        </w:tc>
-        <w:tc>
-          <w:tcPr>
-            <w:tcW w:type="dxa" w:w="4760"/>
+              <w:t xml:space="preserve">每周数量（参考）</w:t>
+            </w:r>
+          </w:p>
+        </w:tc>
+        <w:tc>
+          <w:tcPr>
+            <w:tcW w:type="dxa" w:w="3760"/>
             <w:tcBorders>
               <w:top w:val="single" w:color="CCCCCC" w:sz="6"/>
               <w:left w:val="single" w:color="CCCCCC" w:sz="6"/>
@@ -7073,7 +7379,7 @@
                 <w:sz w:val="19"/>
                 <w:szCs w:val="19"/>
               </w:rPr>
-              <w:t xml:space="preserve">奖品</w:t>
+              <w:t xml:space="preserve">说明</w:t>
             </w:r>
           </w:p>
         </w:tc>
@@ -7081,7 +7387,7 @@
       <w:tr>
         <w:tc>
           <w:tcPr>
-            <w:tcW w:type="dxa" w:w="2200"/>
+            <w:tcW w:type="dxa" w:w="2600"/>
             <w:tcBorders>
               <w:top w:val="single" w:color="CCCCCC" w:sz="6"/>
               <w:left w:val="single" w:color="CCCCCC" w:sz="6"/>
@@ -7108,67 +7414,67 @@
                 <w:sz w:val="19"/>
                 <w:szCs w:val="19"/>
               </w:rPr>
-              <w:t xml:space="preserve">周榜第 1 名</w:t>
-            </w:r>
-          </w:p>
-        </w:tc>
-        <w:tc>
-          <w:tcPr>
-            <w:tcW w:type="dxa" w:w="2400"/>
-            <w:tcBorders>
-              <w:top w:val="single" w:color="CCCCCC" w:sz="6"/>
-              <w:left w:val="single" w:color="CCCCCC" w:sz="6"/>
-              <w:bottom w:val="single" w:color="CCCCCC" w:sz="6"/>
-              <w:right w:val="single" w:color="CCCCCC" w:sz="6"/>
-            </w:tcBorders>
-            <w:tcMar>
-              <w:top w:type="dxa" w:w="70"/>
-              <w:left w:type="dxa" w:w="110"/>
-              <w:bottom w:type="dxa" w:w="70"/>
-              <w:right w:type="dxa" w:w="110"/>
-            </w:tcMar>
-          </w:tcPr>
-          <w:p>
-            <w:pPr>
-              <w:jc w:val="left"/>
-            </w:pPr>
-            <w:r>
-              <w:rPr>
-                <w:rFonts w:ascii="微软雅黑" w:cs="微软雅黑" w:eastAsia="微软雅黑" w:hAnsi="微软雅黑"/>
-                <w:sz w:val="19"/>
-                <w:szCs w:val="19"/>
-              </w:rPr>
-              <w:t xml:space="preserve">每周日 24:00 结算本周点赞数，第 1 名</w:t>
-            </w:r>
-          </w:p>
-        </w:tc>
-        <w:tc>
-          <w:tcPr>
-            <w:tcW w:type="dxa" w:w="4760"/>
-            <w:tcBorders>
-              <w:top w:val="single" w:color="CCCCCC" w:sz="6"/>
-              <w:left w:val="single" w:color="CCCCCC" w:sz="6"/>
-              <w:bottom w:val="single" w:color="CCCCCC" w:sz="6"/>
-              <w:right w:val="single" w:color="CCCCCC" w:sz="6"/>
-            </w:tcBorders>
-            <w:tcMar>
-              <w:top w:type="dxa" w:w="70"/>
-              <w:left w:type="dxa" w:w="110"/>
-              <w:bottom w:type="dxa" w:w="70"/>
-              <w:right w:type="dxa" w:w="110"/>
-            </w:tcMar>
-          </w:tcPr>
-          <w:p>
-            <w:pPr>
-              <w:jc w:val="left"/>
-            </w:pPr>
-            <w:r>
-              <w:rPr>
-                <w:rFonts w:ascii="微软雅黑" w:cs="微软雅黑" w:eastAsia="微软雅黑" w:hAnsi="微软雅黑"/>
-                <w:sz w:val="19"/>
-                <w:szCs w:val="19"/>
-              </w:rPr>
-              <w:t xml:space="preserve">雪球品牌白酒 × 1 瓶</w:t>
+              <w:t xml:space="preserve">雪球品牌白酒</w:t>
+            </w:r>
+          </w:p>
+        </w:tc>
+        <w:tc>
+          <w:tcPr>
+            <w:tcW w:type="dxa" w:w="3000"/>
+            <w:tcBorders>
+              <w:top w:val="single" w:color="CCCCCC" w:sz="6"/>
+              <w:left w:val="single" w:color="CCCCCC" w:sz="6"/>
+              <w:bottom w:val="single" w:color="CCCCCC" w:sz="6"/>
+              <w:right w:val="single" w:color="CCCCCC" w:sz="6"/>
+            </w:tcBorders>
+            <w:tcMar>
+              <w:top w:type="dxa" w:w="70"/>
+              <w:left w:type="dxa" w:w="110"/>
+              <w:bottom w:type="dxa" w:w="70"/>
+              <w:right w:type="dxa" w:w="110"/>
+            </w:tcMar>
+          </w:tcPr>
+          <w:p>
+            <w:pPr>
+              <w:jc w:val="center"/>
+            </w:pPr>
+            <w:r>
+              <w:rPr>
+                <w:rFonts w:ascii="微软雅黑" w:cs="微软雅黑" w:eastAsia="微软雅黑" w:hAnsi="微软雅黑"/>
+                <w:sz w:val="19"/>
+                <w:szCs w:val="19"/>
+              </w:rPr>
+              <w:t xml:space="preserve">1 瓶 / 周</w:t>
+            </w:r>
+          </w:p>
+        </w:tc>
+        <w:tc>
+          <w:tcPr>
+            <w:tcW w:type="dxa" w:w="3760"/>
+            <w:tcBorders>
+              <w:top w:val="single" w:color="CCCCCC" w:sz="6"/>
+              <w:left w:val="single" w:color="CCCCCC" w:sz="6"/>
+              <w:bottom w:val="single" w:color="CCCCCC" w:sz="6"/>
+              <w:right w:val="single" w:color="CCCCCC" w:sz="6"/>
+            </w:tcBorders>
+            <w:tcMar>
+              <w:top w:type="dxa" w:w="70"/>
+              <w:left w:type="dxa" w:w="110"/>
+              <w:bottom w:type="dxa" w:w="70"/>
+              <w:right w:type="dxa" w:w="110"/>
+            </w:tcMar>
+          </w:tcPr>
+          <w:p>
+            <w:pPr>
+              <w:jc w:val="left"/>
+            </w:pPr>
+            <w:r>
+              <w:rPr>
+                <w:rFonts w:ascii="微软雅黑" w:cs="微软雅黑" w:eastAsia="微软雅黑" w:hAnsi="微软雅黑"/>
+                <w:sz w:val="19"/>
+                <w:szCs w:val="19"/>
+              </w:rPr>
+              <w:t xml:space="preserve">稀有奖</w:t>
             </w:r>
           </w:p>
         </w:tc>
@@ -7176,7 +7482,7 @@
       <w:tr>
         <w:tc>
           <w:tcPr>
-            <w:tcW w:type="dxa" w:w="2200"/>
+            <w:tcW w:type="dxa" w:w="2600"/>
             <w:tcBorders>
               <w:top w:val="single" w:color="CCCCCC" w:sz="6"/>
               <w:left w:val="single" w:color="CCCCCC" w:sz="6"/>
@@ -7202,67 +7508,67 @@
                 <w:sz w:val="19"/>
                 <w:szCs w:val="19"/>
               </w:rPr>
-              <w:t xml:space="preserve">周榜第 2-5 名</w:t>
-            </w:r>
-          </w:p>
-        </w:tc>
-        <w:tc>
-          <w:tcPr>
-            <w:tcW w:type="dxa" w:w="2400"/>
-            <w:tcBorders>
-              <w:top w:val="single" w:color="CCCCCC" w:sz="6"/>
-              <w:left w:val="single" w:color="CCCCCC" w:sz="6"/>
-              <w:bottom w:val="single" w:color="CCCCCC" w:sz="6"/>
-              <w:right w:val="single" w:color="CCCCCC" w:sz="6"/>
-            </w:tcBorders>
-            <w:tcMar>
-              <w:top w:type="dxa" w:w="70"/>
-              <w:left w:type="dxa" w:w="110"/>
-              <w:bottom w:type="dxa" w:w="70"/>
-              <w:right w:type="dxa" w:w="110"/>
-            </w:tcMar>
-          </w:tcPr>
-          <w:p>
-            <w:pPr>
-              <w:jc w:val="left"/>
-            </w:pPr>
-            <w:r>
-              <w:rPr>
-                <w:rFonts w:ascii="微软雅黑" w:cs="微软雅黑" w:eastAsia="微软雅黑" w:hAnsi="微软雅黑"/>
-                <w:sz w:val="19"/>
-                <w:szCs w:val="19"/>
-              </w:rPr>
-              <w:t xml:space="preserve">本周点赞数排名 2 / 3 / 4 / 5 名</w:t>
-            </w:r>
-          </w:p>
-        </w:tc>
-        <w:tc>
-          <w:tcPr>
-            <w:tcW w:type="dxa" w:w="4760"/>
-            <w:tcBorders>
-              <w:top w:val="single" w:color="CCCCCC" w:sz="6"/>
-              <w:left w:val="single" w:color="CCCCCC" w:sz="6"/>
-              <w:bottom w:val="single" w:color="CCCCCC" w:sz="6"/>
-              <w:right w:val="single" w:color="CCCCCC" w:sz="6"/>
-            </w:tcBorders>
-            <w:tcMar>
-              <w:top w:type="dxa" w:w="70"/>
-              <w:left w:type="dxa" w:w="110"/>
-              <w:bottom w:type="dxa" w:w="70"/>
-              <w:right w:type="dxa" w:w="110"/>
-            </w:tcMar>
-          </w:tcPr>
-          <w:p>
-            <w:pPr>
-              <w:jc w:val="left"/>
-            </w:pPr>
-            <w:r>
-              <w:rPr>
-                <w:rFonts w:ascii="微软雅黑" w:cs="微软雅黑" w:eastAsia="微软雅黑" w:hAnsi="微软雅黑"/>
-                <w:sz w:val="19"/>
-                <w:szCs w:val="19"/>
-              </w:rPr>
-              <w:t xml:space="preserve">雪球品牌棒球帽 × 1 顶</w:t>
+              <w:t xml:space="preserve">雪球品牌棒球帽</w:t>
+            </w:r>
+          </w:p>
+        </w:tc>
+        <w:tc>
+          <w:tcPr>
+            <w:tcW w:type="dxa" w:w="3000"/>
+            <w:tcBorders>
+              <w:top w:val="single" w:color="CCCCCC" w:sz="6"/>
+              <w:left w:val="single" w:color="CCCCCC" w:sz="6"/>
+              <w:bottom w:val="single" w:color="CCCCCC" w:sz="6"/>
+              <w:right w:val="single" w:color="CCCCCC" w:sz="6"/>
+            </w:tcBorders>
+            <w:tcMar>
+              <w:top w:type="dxa" w:w="70"/>
+              <w:left w:type="dxa" w:w="110"/>
+              <w:bottom w:type="dxa" w:w="70"/>
+              <w:right w:type="dxa" w:w="110"/>
+            </w:tcMar>
+          </w:tcPr>
+          <w:p>
+            <w:pPr>
+              <w:jc w:val="center"/>
+            </w:pPr>
+            <w:r>
+              <w:rPr>
+                <w:rFonts w:ascii="微软雅黑" w:cs="微软雅黑" w:eastAsia="微软雅黑" w:hAnsi="微软雅黑"/>
+                <w:sz w:val="19"/>
+                <w:szCs w:val="19"/>
+              </w:rPr>
+              <w:t xml:space="preserve">约 10 顶 / 周</w:t>
+            </w:r>
+          </w:p>
+        </w:tc>
+        <w:tc>
+          <w:tcPr>
+            <w:tcW w:type="dxa" w:w="3760"/>
+            <w:tcBorders>
+              <w:top w:val="single" w:color="CCCCCC" w:sz="6"/>
+              <w:left w:val="single" w:color="CCCCCC" w:sz="6"/>
+              <w:bottom w:val="single" w:color="CCCCCC" w:sz="6"/>
+              <w:right w:val="single" w:color="CCCCCC" w:sz="6"/>
+            </w:tcBorders>
+            <w:tcMar>
+              <w:top w:type="dxa" w:w="70"/>
+              <w:left w:type="dxa" w:w="110"/>
+              <w:bottom w:type="dxa" w:w="70"/>
+              <w:right w:type="dxa" w:w="110"/>
+            </w:tcMar>
+          </w:tcPr>
+          <w:p>
+            <w:pPr>
+              <w:jc w:val="left"/>
+            </w:pPr>
+            <w:r>
+              <w:rPr>
+                <w:rFonts w:ascii="微软雅黑" w:cs="微软雅黑" w:eastAsia="微软雅黑" w:hAnsi="微软雅黑"/>
+                <w:sz w:val="19"/>
+                <w:szCs w:val="19"/>
+              </w:rPr>
+              <w:t xml:space="preserve">常规奖</w:t>
             </w:r>
           </w:p>
         </w:tc>
@@ -7282,7 +7588,7 @@
           <w:sz w:val="19"/>
           <w:szCs w:val="19"/>
         </w:rPr>
-        <w:t xml:space="preserve">注：早期版本有"每日奖"和"获奖名额顺延"规则，现已取消。当前仅按周评奖。</w:t>
+        <w:t xml:space="preserve">每周奖品数量为参考值，具体中奖概率由产研按奖品库存 / 参与人数设定。</w:t>
       </w:r>
     </w:p>
     <w:p>
@@ -7299,7 +7605,7 @@
           <w:sz w:val="24"/>
           <w:szCs w:val="24"/>
         </w:rPr>
-        <w:t xml:space="preserve">6.4 开奖与通知</w:t>
+        <w:t xml:space="preserve">6.4 中奖与发奖</w:t>
       </w:r>
     </w:p>
     <w:p>
@@ -7317,7 +7623,7 @@
           <w:sz w:val="21"/>
           <w:szCs w:val="21"/>
         </w:rPr>
-        <w:t xml:space="preserve">每周获奖名单通过雪球官方发帖公示</w:t>
+        <w:t xml:space="preserve">用户在 H5 即时得知中奖结果</w:t>
       </w:r>
     </w:p>
     <w:p>
@@ -7335,7 +7641,7 @@
           <w:sz w:val="21"/>
           <w:szCs w:val="21"/>
         </w:rPr>
-        <w:t xml:space="preserve">中奖结果通过雪球站内信实时通知获奖球友</w:t>
+        <w:t xml:space="preserve">中奖球友需提供收货信息，由雪球官方统一寄出实物奖品</w:t>
       </w:r>
     </w:p>
     <w:p>
@@ -7353,7 +7659,7 @@
           <w:sz w:val="21"/>
           <w:szCs w:val="21"/>
         </w:rPr>
-        <w:t xml:space="preserve">获奖球友收到站内信后，按提示回复收货信息，由雪球官方统一寄出</w:t>
+        <w:t xml:space="preserve">收货信息可通过雪球站内信跟进收集</w:t>
       </w:r>
     </w:p>
     <w:p>
@@ -7371,7 +7677,7 @@
           <w:sz w:val="21"/>
           <w:szCs w:val="21"/>
         </w:rPr>
-        <w:t xml:space="preserve">未及时回复 / 地址失效导致无法送达的，视为放弃</w:t>
+        <w:t xml:space="preserve">未及时提供 / 地址失效导致无法送达的，视为放弃</w:t>
       </w:r>
     </w:p>
     <w:p>
@@ -7401,61 +7707,61 @@
           <w:sz w:val="21"/>
           <w:szCs w:val="21"/>
         </w:rPr>
-        <w:t xml:space="preserve">阵容结果页操作区 3 个按钮：</w:t>
-      </w:r>
-    </w:p>
-    <w:p>
-      <w:pPr>
-        <w:pStyle w:val="ListParagraph"/>
-        <w:numPr>
-          <w:ilvl w:val="0"/>
-          <w:numId w:val="2"/>
-        </w:numPr>
-        <w:spacing w:after="60"/>
-      </w:pPr>
-      <w:r>
-        <w:rPr>
-          <w:rFonts w:ascii="微软雅黑" w:cs="微软雅黑" w:eastAsia="微软雅黑" w:hAnsi="微软雅黑"/>
-          <w:sz w:val="21"/>
-          <w:szCs w:val="21"/>
-        </w:rPr>
-        <w:t xml:space="preserve">① 一键发布：先把"付费招商客户"的产品加入雪球自选 → 加成功后才生成海报 → 自动保存到相册。加自选是生成海报的前置条件。</w:t>
-      </w:r>
-    </w:p>
-    <w:p>
-      <w:pPr>
-        <w:pStyle w:val="ListParagraph"/>
-        <w:numPr>
-          <w:ilvl w:val="0"/>
-          <w:numId w:val="2"/>
-        </w:numPr>
-        <w:spacing w:after="60"/>
-      </w:pPr>
-      <w:r>
-        <w:rPr>
-          <w:rFonts w:ascii="微软雅黑" w:cs="微软雅黑" w:eastAsia="微软雅黑" w:hAnsi="微软雅黑"/>
-          <w:sz w:val="21"/>
-          <w:szCs w:val="21"/>
-        </w:rPr>
-        <w:t xml:space="preserve">② 分享朋友圈：把海报分享到微信朋友圈（生成海报后可用）</w:t>
-      </w:r>
-    </w:p>
-    <w:p>
-      <w:pPr>
-        <w:pStyle w:val="ListParagraph"/>
-        <w:numPr>
-          <w:ilvl w:val="0"/>
-          <w:numId w:val="2"/>
-        </w:numPr>
-        <w:spacing w:after="60"/>
-      </w:pPr>
-      <w:r>
-        <w:rPr>
-          <w:rFonts w:ascii="微软雅黑" w:cs="微软雅黑" w:eastAsia="微软雅黑" w:hAnsi="微软雅黑"/>
-          <w:sz w:val="21"/>
-          <w:szCs w:val="21"/>
-        </w:rPr>
-        <w:t xml:space="preserve">③ 重新组队：清空重来</w:t>
+        <w:t xml:space="preserve">「一键发布」是获得抽奖机会的关键动作，依次执行：</w:t>
+      </w:r>
+    </w:p>
+    <w:p>
+      <w:pPr>
+        <w:pStyle w:val="ListParagraph"/>
+        <w:numPr>
+          <w:ilvl w:val="0"/>
+          <w:numId w:val="3"/>
+        </w:numPr>
+        <w:spacing w:after="60"/>
+      </w:pPr>
+      <w:r>
+        <w:rPr>
+          <w:rFonts w:ascii="微软雅黑" w:cs="微软雅黑" w:eastAsia="微软雅黑" w:hAnsi="微软雅黑"/>
+          <w:sz w:val="21"/>
+          <w:szCs w:val="21"/>
+        </w:rPr>
+        <w:t xml:space="preserve">加自选：把本周付费招商客户的产品加入雪球自选（每个客户 1 只，见 5.3）</w:t>
+      </w:r>
+    </w:p>
+    <w:p>
+      <w:pPr>
+        <w:pStyle w:val="ListParagraph"/>
+        <w:numPr>
+          <w:ilvl w:val="0"/>
+          <w:numId w:val="3"/>
+        </w:numPr>
+        <w:spacing w:after="60"/>
+      </w:pPr>
+      <w:r>
+        <w:rPr>
+          <w:rFonts w:ascii="微软雅黑" w:cs="微软雅黑" w:eastAsia="微软雅黑" w:hAnsi="微软雅黑"/>
+          <w:sz w:val="21"/>
+          <w:szCs w:val="21"/>
+        </w:rPr>
+        <w:t xml:space="preserve">生成海报</w:t>
+      </w:r>
+    </w:p>
+    <w:p>
+      <w:pPr>
+        <w:pStyle w:val="ListParagraph"/>
+        <w:numPr>
+          <w:ilvl w:val="0"/>
+          <w:numId w:val="3"/>
+        </w:numPr>
+        <w:spacing w:after="60"/>
+      </w:pPr>
+      <w:r>
+        <w:rPr>
+          <w:rFonts w:ascii="微软雅黑" w:cs="微软雅黑" w:eastAsia="微软雅黑" w:hAnsi="微软雅黑"/>
+          <w:sz w:val="21"/>
+          <w:szCs w:val="21"/>
+        </w:rPr>
+        <w:t xml:space="preserve">海报生成完成 → 触发抽奖 → 即时弹出结果</w:t>
       </w:r>
     </w:p>
     <w:p>
@@ -7472,7 +7778,7 @@
           <w:sz w:val="19"/>
           <w:szCs w:val="19"/>
         </w:rPr>
-        <w:t xml:space="preserve">"加自选"只加付费招商客户的产品（非阵容全部 11 只）。付费名单见 5.3。加自选 / 分享朋友圈均为雪球 JSBridge 占位，见第七章。</w:t>
+        <w:t xml:space="preserve">加自选的产品由后端接口返回（每个付费客户 1 只优先级产品），H5 照单加入；非阵容全部 11 只。加自选为雪球 JSBridge 调用，见第七章。</w:t>
       </w:r>
     </w:p>
     <w:p>
@@ -7716,7 +8022,7 @@
                 <w:sz w:val="19"/>
                 <w:szCs w:val="19"/>
               </w:rPr>
-              <w:t xml:space="preserve">付费招商客户名单 + 签约顺序，替换 PAID_SPONSORS</w:t>
+              <w:t xml:space="preserve">本周付费客户 + 各自加自选的优先级产品（H5 照单加自选）</w:t>
             </w:r>
           </w:p>
         </w:tc>
@@ -7810,7 +8116,7 @@
                 <w:sz w:val="19"/>
                 <w:szCs w:val="19"/>
               </w:rPr>
-              <w:t xml:space="preserve">GET /api/etf-campaign/rankings</w:t>
+              <w:t xml:space="preserve">POST /api/etf-campaign/lottery</w:t>
             </w:r>
           </w:p>
         </w:tc>
@@ -7840,7 +8146,69 @@
                 <w:sz w:val="19"/>
                 <w:szCs w:val="19"/>
               </w:rPr>
-              <w:t xml:space="preserve">真实点赞榜单（当前为 mock 假数据）</w:t>
+              <w:t xml:space="preserve">抽奖：校验本周机会、执行抽奖、返回中奖结果</w:t>
+            </w:r>
+          </w:p>
+        </w:tc>
+      </w:tr>
+      <w:tr>
+        <w:tc>
+          <w:tcPr>
+            <w:tcW w:type="dxa" w:w="3400"/>
+            <w:tcBorders>
+              <w:top w:val="single" w:color="CCCCCC" w:sz="6"/>
+              <w:left w:val="single" w:color="CCCCCC" w:sz="6"/>
+              <w:bottom w:val="single" w:color="CCCCCC" w:sz="6"/>
+              <w:right w:val="single" w:color="CCCCCC" w:sz="6"/>
+            </w:tcBorders>
+            <w:tcMar>
+              <w:top w:type="dxa" w:w="70"/>
+              <w:left w:type="dxa" w:w="110"/>
+              <w:bottom w:type="dxa" w:w="70"/>
+              <w:right w:type="dxa" w:w="110"/>
+            </w:tcMar>
+          </w:tcPr>
+          <w:p>
+            <w:pPr>
+              <w:jc w:val="left"/>
+            </w:pPr>
+            <w:r>
+              <w:rPr>
+                <w:rFonts w:ascii="微软雅黑" w:cs="微软雅黑" w:eastAsia="微软雅黑" w:hAnsi="微软雅黑"/>
+                <w:sz w:val="19"/>
+                <w:szCs w:val="19"/>
+              </w:rPr>
+              <w:t xml:space="preserve">GET /api/etf-campaign/lottery/status</w:t>
+            </w:r>
+          </w:p>
+        </w:tc>
+        <w:tc>
+          <w:tcPr>
+            <w:tcW w:type="dxa" w:w="5960"/>
+            <w:tcBorders>
+              <w:top w:val="single" w:color="CCCCCC" w:sz="6"/>
+              <w:left w:val="single" w:color="CCCCCC" w:sz="6"/>
+              <w:bottom w:val="single" w:color="CCCCCC" w:sz="6"/>
+              <w:right w:val="single" w:color="CCCCCC" w:sz="6"/>
+            </w:tcBorders>
+            <w:tcMar>
+              <w:top w:type="dxa" w:w="70"/>
+              <w:left w:type="dxa" w:w="110"/>
+              <w:bottom w:type="dxa" w:w="70"/>
+              <w:right w:type="dxa" w:w="110"/>
+            </w:tcMar>
+          </w:tcPr>
+          <w:p>
+            <w:pPr>
+              <w:jc w:val="left"/>
+            </w:pPr>
+            <w:r>
+              <w:rPr>
+                <w:rFonts w:ascii="微软雅黑" w:cs="微软雅黑" w:eastAsia="微软雅黑" w:hAnsi="微软雅黑"/>
+                <w:sz w:val="19"/>
+                <w:szCs w:val="19"/>
+              </w:rPr>
+              <w:t xml:space="preserve">查询用户本周是否已用过抽奖机会</w:t>
             </w:r>
           </w:p>
         </w:tc>
@@ -7935,7 +8303,7 @@
           <w:sz w:val="21"/>
           <w:szCs w:val="21"/>
         </w:rPr>
-        <w:t xml:space="preserve">src/utils/xueqiuBridge.js 已封装两个占位方法，上线时替换为雪球 native 真实调用：</w:t>
+        <w:t xml:space="preserve">src/utils/xueqiuBridge.js 已封装占位方法，上线时替换为雪球 native 真实调用：</w:t>
       </w:r>
     </w:p>
     <w:p>
@@ -7953,7 +8321,7 @@
           <w:sz w:val="21"/>
           <w:szCs w:val="21"/>
         </w:rPr>
-        <w:t xml:space="preserve">addToWatchlist(codes)：一键加自选。真实实现需在加自选成功时返回 { ok: true }，失败返回 { ok: false }，由调用方据此决定是否放行海报生成。</w:t>
+        <w:t xml:space="preserve">addToWatchlist(codes)：加自选。真实实现需在加自选成功时返回 { ok: true }，失败返回 { ok: false }，由调用方据此决定是否放行后续生成海报 / 抽奖。</w:t>
       </w:r>
     </w:p>
     <w:p>
@@ -7971,7 +8339,7 @@
           <w:sz w:val="21"/>
           <w:szCs w:val="21"/>
         </w:rPr>
-        <w:t xml:space="preserve">shareToFriendCircle(image, title)：分享到朋友圈。</w:t>
+        <w:t xml:space="preserve">海报保存：iOS WebView 内 a.click() 下载可能失效，建议接雪球 saveImage JSBridge。</w:t>
       </w:r>
     </w:p>
     <w:p>
@@ -7989,7 +8357,7 @@
           <w:sz w:val="21"/>
           <w:szCs w:val="21"/>
         </w:rPr>
-        <w:t xml:space="preserve">海报保存：iOS WebView 内 a.click() 下载可能失效，建议接雪球 saveImage JSBridge。</w:t>
+        <w:t xml:space="preserve">发帖到活动主帖：中奖后引导用户去主帖晒奖，建议接雪球发帖 JSBridge（携带海报图）。</w:t>
       </w:r>
     </w:p>
     <w:p>
@@ -8042,7 +8410,7 @@
           <w:sz w:val="21"/>
           <w:szCs w:val="21"/>
         </w:rPr>
-        <w:t xml:space="preserve">点赞计数：当前为 localStorage mock，需接真实接口</w:t>
+        <w:t xml:space="preserve">抽奖：需接后端抽奖接口，含"一周一人一次"机会校验、中奖概率 / 库存控制</w:t>
       </w:r>
     </w:p>
     <w:p>
@@ -8078,7 +8446,7 @@
           <w:sz w:val="21"/>
           <w:szCs w:val="21"/>
         </w:rPr>
-        <w:t xml:space="preserve">埋点：src/utils/analytics.js 当前 console 输出，需替换为真实埋点 SDK</w:t>
+        <w:t xml:space="preserve">埋点：src/utils/analytics.js 当前 console 输出，需替换为真实埋点 SDK；抽奖全链路埋点必做</w:t>
       </w:r>
     </w:p>
     <w:p>

</xml_diff>